<commit_message>
docs(examples/revisions): 7a uses regex lookbehind to track only the first 'fox' match
Bare `find=fox` matches every occurrence, which doesn't surface what
makes find+revision useful — the ability to scope the tracked edit to
one specific occurrence and leave the rest alone (Word's "Find Next →
Replace, skip the rest" UX). Switching 7a to the regex form
`(?<!fox.*)fox` with regex=true demonstrates that pattern: only the
first 'fox' becomes a del+ins pair, the second is untouched.

.NET regex's variable-width negative lookbehind makes this a one-liner;
no client-side counting needed.
</commit_message>
<xml_diff>
--- a/examples/word/revisions.docx
+++ b/examples/word/revisions.docx
@@ -416,22 +416,6 @@
         <w:rPr/>
         <w:t xml:space="preserve">7a. The </w:t>
       </w:r>
-      <w:del w:author="Iris" w:date="2026-05-25T18:50:00+08:00" w:id="1048684">
-        <w:r>
-          <w:rPr/>
-          <w:delText xml:space="preserve">fox</w:delText>
-        </w:r>
-      </w:del>
-      <w:ins w:author="Iris" w:date="2026-05-25T18:50:00+08:00" w:id="1048685">
-        <w:r>
-          <w:rPr/>
-          <w:t xml:space="preserve">cat</w:t>
-        </w:r>
-      </w:ins>
-      <w:r>
-        <w:rPr/>
-        <w:t xml:space="preserve"> jumped over the lazy dog. (run find+replace to track '</w:t>
-      </w:r>
       <w:del w:author="Iris" w:date="2026-05-25T18:50:00+08:00" w:id="1048682">
         <w:r>
           <w:rPr/>
@@ -446,7 +430,7 @@
       </w:ins>
       <w:r>
         <w:rPr/>
-        <w:t xml:space="preserve">'→'cat')</w:t>
+        <w:t xml:space="preserve"> jumped and another fox ran fast. (regex tracks only the 1st 'fox'→'cat')</w:t>
       </w:r>
     </w:p>
     <w:p>
@@ -454,32 +438,6 @@
       <w:r>
         <w:rPr/>
         <w:t xml:space="preserve">7b. Color </w:t>
-      </w:r>
-      <w:r>
-        <w:rPr>
-          <w:b/>
-          <w:rPrChange w:author="Jack" w:date="2026-05-25T18:51:00+08:00" w:id="1048691">
-            <w:rPr/>
-          </w:rPrChange>
-        </w:rPr>
-        <w:t xml:space="preserve">red</w:t>
-      </w:r>
-      <w:r>
-        <w:rPr/>
-        <w:t xml:space="preserve"> apples and the </w:t>
-      </w:r>
-      <w:r>
-        <w:rPr>
-          <w:b/>
-          <w:rPrChange w:author="Jack" w:date="2026-05-25T18:51:00+08:00" w:id="1048690">
-            <w:rPr/>
-          </w:rPrChange>
-        </w:rPr>
-        <w:t xml:space="preserve">red</w:t>
-      </w:r>
-      <w:r>
-        <w:rPr/>
-        <w:t xml:space="preserve"> barn. (tracked bold on every '</w:t>
       </w:r>
       <w:r>
         <w:rPr>
@@ -492,6 +450,32 @@
       </w:r>
       <w:r>
         <w:rPr/>
+        <w:t xml:space="preserve"> apples and the </w:t>
+      </w:r>
+      <w:r>
+        <w:rPr>
+          <w:b/>
+          <w:rPrChange w:author="Jack" w:date="2026-05-25T18:51:00+08:00" w:id="1048688">
+            <w:rPr/>
+          </w:rPrChange>
+        </w:rPr>
+        <w:t xml:space="preserve">red</w:t>
+      </w:r>
+      <w:r>
+        <w:rPr/>
+        <w:t xml:space="preserve"> barn. (tracked bold on every '</w:t>
+      </w:r>
+      <w:r>
+        <w:rPr>
+          <w:b/>
+          <w:rPrChange w:author="Jack" w:date="2026-05-25T18:51:00+08:00" w:id="1048687">
+            <w:rPr/>
+          </w:rPrChange>
+        </w:rPr>
+        <w:t xml:space="preserve">red</w:t>
+      </w:r>
+      <w:r>
+        <w:rPr/>
         <w:t xml:space="preserve">')</w:t>
       </w:r>
     </w:p>
@@ -501,13 +485,13 @@
         <w:rPr/>
         <w:t xml:space="preserve">7c. Replace </w:t>
       </w:r>
-      <w:del w:author="Kelly" w:date="2026-05-25T18:52:00+08:00" w:id="1048697">
+      <w:del w:author="Kelly" w:date="2026-05-25T18:52:00+08:00" w:id="1048695">
         <w:r>
           <w:rPr/>
           <w:delText xml:space="preserve">bar</w:delText>
         </w:r>
       </w:del>
-      <w:ins w:author="Kelly" w:date="2026-05-25T18:52:00+08:00" w:id="1048698">
+      <w:ins w:author="Kelly" w:date="2026-05-25T18:52:00+08:00" w:id="1048696">
         <w:r>
           <w:rPr>
             <w:b/>
@@ -520,13 +504,13 @@
         <w:rPr/>
         <w:t xml:space="preserve"> with FOO. (tracked replace '</w:t>
       </w:r>
-      <w:del w:author="Kelly" w:date="2026-05-25T18:52:00+08:00" w:id="1048695">
+      <w:del w:author="Kelly" w:date="2026-05-25T18:52:00+08:00" w:id="1048693">
         <w:r>
           <w:rPr/>
           <w:delText xml:space="preserve">bar</w:delText>
         </w:r>
       </w:del>
-      <w:ins w:author="Kelly" w:date="2026-05-25T18:52:00+08:00" w:id="1048696">
+      <w:ins w:author="Kelly" w:date="2026-05-25T18:52:00+08:00" w:id="1048694">
         <w:r>
           <w:rPr>
             <w:b/>
@@ -549,7 +533,7 @@
       <w:r>
         <w:rPr>
           <w:b/>
-          <w:rPrChange w:author="Liam" w:date="2026-05-25T18:53:00+08:00" w:id="1048704">
+          <w:rPrChange w:author="Liam" w:date="2026-05-25T18:53:00+08:00" w:id="1048702">
             <w:rPr/>
           </w:rPrChange>
         </w:rPr>
@@ -562,7 +546,7 @@
       <w:r>
         <w:rPr>
           <w:b/>
-          <w:rPrChange w:author="Liam" w:date="2026-05-25T18:53:00+08:00" w:id="1048703">
+          <w:rPrChange w:author="Liam" w:date="2026-05-25T18:53:00+08:00" w:id="1048701">
             <w:rPr/>
           </w:rPrChange>
         </w:rPr>
@@ -575,7 +559,7 @@
       <w:r>
         <w:rPr>
           <w:b/>
-          <w:rPrChange w:author="Liam" w:date="2026-05-25T18:53:00+08:00" w:id="1048702">
+          <w:rPrChange w:author="Liam" w:date="2026-05-25T18:53:00+08:00" w:id="1048700">
             <w:rPr/>
           </w:rPrChange>
         </w:rPr>

</xml_diff>